<commit_message>
Documentación sincronizada con el modelo v4: cifras ancla, versiones vigentes, mapa de archivos, pendientes, contexto del LLM; documentos por sección regenerados
Co-Authored-By: Claude Sonnet 5.5 <noreply@anthropic.com>
Claude-Session: https://claude.ai/code/session_0188QZHBkA8n5QL7BtmFakQg
</commit_message>
<xml_diff>
--- a/secciones/industria/anexo/Mallplaza_Industria_EN_Anexo.docx
+++ b/secciones/industria/anexo/Mallplaza_Industria_EN_Anexo.docx
@@ -54,7 +54,7 @@
           <w:sz w:val="16"/>
           <w:szCs w:val="16"/>
         </w:rPr>
-        <w:t xml:space="preserve">The trio will add 432,030 m² between 2026 and 2028, of which 334,030 m² are organic (6.4% of their current total GLA; in Chile, 219,900 m², equivalent to 6.7% of their GLA in that country). Acquisitions (98,000 m², all by Parque Arauco) change owner but add no supply to the industry; the supply-versus-demand analysis for Chile (Figure 3) therefore uses organic GLA only.</w:t>
+        <w:t xml:space="preserve">The trio will add 432,030 m² between 2026 and 2028, of which 334,030 m² are organic (6.4% of their current total GLA; in Chile, 219,900 m², equivalent to 5.1% of the industry's GLA in Chile and 6.7% of the trio's own GLA). Acquisitions (98,000 m², all by Parque Arauco) change owner but add no supply to the industry; the supply-versus-demand analysis for Chile (Figure 3) therefore uses organic GLA only.</w:t>
       </w:r>
     </w:p>
     <w:tbl>
@@ -1698,7 +1698,7 @@
                 <w:sz w:val="11"/>
                 <w:szCs w:val="11"/>
               </w:rPr>
-              <w:t xml:space="preserve">Org./GLA = organic GLA 2026-2028 over consolidated GLA at 2Q26. Mallplaza: 2028 includes 46,500 m² of “Other projects Chile”, dated 2028 by the 2025 Annual Report (p.45). Parque Arauco: 2026 = 2H26 (acquisitions). Cenco: deliveries given as a range are placed at the end of the range.</w:t>
+              <w:t xml:space="preserve">Org./GLA = organic GLA 2026-2028 over consolidated GLA at 2Q26. Mallplaza: 2028 includes 46,500 m² of “Other projects Chile”, dated 2028 by the 2025 Annual Report (p.45). Parque Arauco: 2026 = 2H26 (acquisitions). Cenco: deliveries given as a range are placed at the end of the range. In Chile, the trio's organic supply (219,900 m²) equals 5.1% of the estimated industry GLA (≈4.3 million m²: 3.29 million of the trio excluding offices ÷ 76%, its share of the main operators).</w:t>
             </w:r>
           </w:p>
           <w:p/>
@@ -2531,7 +2531,7 @@
                 <w:sz w:val="13"/>
                 <w:szCs w:val="13"/>
               </w:rPr>
-              <w:t xml:space="preserve">CR3 76% / 37% / 13%; reinvestment race in experience; asset purchases (Minka, Plaza Central; Quilín and Chicureo announced); supply above consumption in 2027-28. Stable shares and margins of 71-90%. No price war: positive SSR/SAR in Chile (table B).</w:t>
+              <w:t xml:space="preserve">CR3 76% / 37% / 13%; reinvestment race in experience; asset purchases (Minka, Plaza Central; Quilín and Chicureo announced); supply catching up with consumption in 2027. Stable shares and margins of 71-90%. No price war: positive SSR/SAR in Chile (table B).</w:t>
             </w:r>
           </w:p>
         </w:tc>
@@ -5683,7 +5683,7 @@
                 <w:sz w:val="13"/>
                 <w:szCs w:val="13"/>
               </w:rPr>
-              <w:t xml:space="preserve">Chile only and only m² that depend on consumption (excludes offices and multifamily); base GLA excludes Cenco's offices. Private consumption from the September 2026 IPoM is used as a demand indicator, not as a sales projection.</w:t>
+              <w:t xml:space="preserve">Chile only and only m² that depend on consumption (excludes offices and multifamily); base GLA excludes Cenco's offices. Private consumption from the September 2026 IPoM is used as a demand indicator, not as a sales projection. Industry GLA in Chile ≈ trio GLA excluding offices ÷ 76% (the trio's share of the main operators, slide 7); the trio's supply is a lower bound of the industry's supply.</w:t>
             </w:r>
           </w:p>
         </w:tc>

</xml_diff>